<commit_message>
update: revised lab work and attached report.
</commit_message>
<xml_diff>
--- a/lab10/Лабораторна робота №10.docx
+++ b/lab10/Лабораторна робота №10.docx
@@ -6558,6 +6558,9 @@
               <w:rPr>
                 <w:rFonts w:ascii="Courier New" w:eastAsia="Courier New" w:hAnsi="Courier New" w:cs="Courier New"/>
                 <w:noProof/>
+                <w:color w:val="000000" w:themeColor="text1"/>
+                <w:sz w:val="20"/>
+                <w:szCs w:val="20"/>
               </w:rPr>
             </w:pPr>
             <w:r>
@@ -6573,465 +6576,313 @@
               <w:rPr>
                 <w:rFonts w:ascii="Courier New" w:eastAsia="Courier New" w:hAnsi="Courier New" w:cs="Courier New"/>
                 <w:noProof/>
-                <w:color w:val="3A7C22" w:themeColor="accent6" w:themeShade="BF"/>
-                <w:sz w:val="20"/>
-                <w:szCs w:val="20"/>
-              </w:rPr>
-              <w:t>/</w:t>
-            </w:r>
-            <w:r>
-              <w:rPr>
-                <w:rFonts w:ascii="Courier New" w:eastAsia="Courier New" w:hAnsi="Courier New" w:cs="Courier New"/>
-                <w:noProof/>
-                <w:color w:val="3A7C22" w:themeColor="accent6" w:themeShade="BF"/>
-                <w:sz w:val="20"/>
-                <w:szCs w:val="20"/>
-              </w:rPr>
-              <w:t>/ LSP - кожен з сендерів повноцінно замінює INotificationSender</w:t>
-            </w:r>
-            <w:r>
-              <w:rPr>
-                <w:rFonts w:ascii="Courier New" w:eastAsia="Courier New" w:hAnsi="Courier New" w:cs="Courier New"/>
-                <w:noProof/>
-                <w:color w:val="3A7C22" w:themeColor="accent6" w:themeShade="BF"/>
+                <w:color w:val="000000" w:themeColor="text1"/>
+                <w:sz w:val="20"/>
+                <w:szCs w:val="20"/>
+              </w:rPr>
+              <w:t>List&lt;INotificationSender&gt; senders = new List&lt;INotificationSender&gt;</w:t>
+            </w:r>
+          </w:p>
+          <w:p>
+            <w:pPr>
+              <w:rPr>
+                <w:rFonts w:ascii="Courier New" w:eastAsia="Courier New" w:hAnsi="Courier New" w:cs="Courier New"/>
+                <w:noProof/>
+                <w:color w:val="000000" w:themeColor="text1"/>
+                <w:sz w:val="20"/>
+                <w:szCs w:val="20"/>
+              </w:rPr>
+            </w:pPr>
+            <w:r>
+              <w:rPr>
+                <w:rFonts w:ascii="Courier New" w:eastAsia="Courier New" w:hAnsi="Courier New" w:cs="Courier New"/>
+                <w:noProof/>
+                <w:color w:val="000000" w:themeColor="text1"/>
+                <w:sz w:val="20"/>
+                <w:szCs w:val="20"/>
+              </w:rPr>
+              <w:t>            {</w:t>
+            </w:r>
+          </w:p>
+          <w:p>
+            <w:pPr>
+              <w:rPr>
+                <w:rFonts w:ascii="Courier New" w:eastAsia="Courier New" w:hAnsi="Courier New" w:cs="Courier New"/>
+                <w:noProof/>
+                <w:color w:val="000000" w:themeColor="text1"/>
+                <w:sz w:val="20"/>
+                <w:szCs w:val="20"/>
+              </w:rPr>
+            </w:pPr>
+            <w:r>
+              <w:rPr>
+                <w:rFonts w:ascii="Courier New" w:eastAsia="Courier New" w:hAnsi="Courier New" w:cs="Courier New"/>
+                <w:noProof/>
+                <w:color w:val="000000" w:themeColor="text1"/>
+                <w:sz w:val="20"/>
+                <w:szCs w:val="20"/>
+              </w:rPr>
+              <w:t>                new EmailSender(),</w:t>
+            </w:r>
+          </w:p>
+          <w:p>
+            <w:pPr>
+              <w:rPr>
+                <w:rFonts w:ascii="Courier New" w:eastAsia="Courier New" w:hAnsi="Courier New" w:cs="Courier New"/>
+                <w:noProof/>
+                <w:color w:val="000000" w:themeColor="text1"/>
+                <w:sz w:val="20"/>
+                <w:szCs w:val="20"/>
+              </w:rPr>
+            </w:pPr>
+            <w:r>
+              <w:rPr>
+                <w:rFonts w:ascii="Courier New" w:eastAsia="Courier New" w:hAnsi="Courier New" w:cs="Courier New"/>
+                <w:noProof/>
+                <w:color w:val="000000" w:themeColor="text1"/>
+                <w:sz w:val="20"/>
+                <w:szCs w:val="20"/>
+              </w:rPr>
+              <w:t>                new TelegramSender(),</w:t>
+            </w:r>
+          </w:p>
+          <w:p>
+            <w:pPr>
+              <w:rPr>
+                <w:rFonts w:ascii="Courier New" w:eastAsia="Courier New" w:hAnsi="Courier New" w:cs="Courier New"/>
+                <w:noProof/>
+                <w:color w:val="000000" w:themeColor="text1"/>
+                <w:sz w:val="20"/>
+                <w:szCs w:val="20"/>
+              </w:rPr>
+            </w:pPr>
+            <w:r>
+              <w:rPr>
+                <w:rFonts w:ascii="Courier New" w:eastAsia="Courier New" w:hAnsi="Courier New" w:cs="Courier New"/>
+                <w:noProof/>
+                <w:color w:val="000000" w:themeColor="text1"/>
+                <w:sz w:val="20"/>
+                <w:szCs w:val="20"/>
+              </w:rPr>
+              <w:t>                new PushSender(),</w:t>
+            </w:r>
+          </w:p>
+          <w:p>
+            <w:pPr>
+              <w:rPr>
+                <w:rFonts w:ascii="Courier New" w:eastAsia="Courier New" w:hAnsi="Courier New" w:cs="Courier New"/>
+                <w:noProof/>
+                <w:color w:val="000000" w:themeColor="text1"/>
+                <w:sz w:val="20"/>
+                <w:szCs w:val="20"/>
+              </w:rPr>
+            </w:pPr>
+            <w:r>
+              <w:rPr>
+                <w:rFonts w:ascii="Courier New" w:eastAsia="Courier New" w:hAnsi="Courier New" w:cs="Courier New"/>
+                <w:noProof/>
+                <w:color w:val="000000" w:themeColor="text1"/>
+                <w:sz w:val="20"/>
+                <w:szCs w:val="20"/>
+              </w:rPr>
+              <w:t>                new SmsSender()</w:t>
+            </w:r>
+          </w:p>
+          <w:p>
+            <w:pPr>
+              <w:rPr>
+                <w:rFonts w:ascii="Courier New" w:eastAsia="Courier New" w:hAnsi="Courier New" w:cs="Courier New"/>
+                <w:noProof/>
+                <w:color w:val="000000" w:themeColor="text1"/>
+                <w:sz w:val="20"/>
+                <w:szCs w:val="20"/>
+              </w:rPr>
+            </w:pPr>
+            <w:r>
+              <w:rPr>
+                <w:rFonts w:ascii="Courier New" w:eastAsia="Courier New" w:hAnsi="Courier New" w:cs="Courier New"/>
+                <w:noProof/>
+                <w:color w:val="000000" w:themeColor="text1"/>
+                <w:sz w:val="20"/>
+                <w:szCs w:val="20"/>
+              </w:rPr>
+              <w:t>            };</w:t>
+            </w:r>
+          </w:p>
+          <w:p>
+            <w:pPr>
+              <w:rPr>
+                <w:rFonts w:ascii="Courier New" w:eastAsia="Courier New" w:hAnsi="Courier New" w:cs="Courier New"/>
+                <w:noProof/>
+                <w:color w:val="000000" w:themeColor="text1"/>
+                <w:sz w:val="20"/>
+                <w:szCs w:val="20"/>
+              </w:rPr>
+            </w:pPr>
+            <w:r>
+              <w:rPr>
+                <w:rFonts w:ascii="Courier New" w:eastAsia="Courier New" w:hAnsi="Courier New" w:cs="Courier New"/>
+                <w:noProof/>
+                <w:color w:val="000000" w:themeColor="text1"/>
                 <w:sz w:val="20"/>
                 <w:szCs w:val="20"/>
               </w:rPr>
               <w:br/>
-              <w:t xml:space="preserve">            // OCP - щоб додати новий канал, достатньо створити новий клас-сендер</w:t>
-            </w:r>
-            <w:r>
-              <w:rPr>
-                <w:rFonts w:ascii="Courier New" w:eastAsia="Courier New" w:hAnsi="Courier New" w:cs="Courier New"/>
-                <w:noProof/>
-                <w:color w:val="3A7C22" w:themeColor="accent6" w:themeShade="BF"/>
-                <w:sz w:val="20"/>
-                <w:szCs w:val="20"/>
-              </w:rPr>
-              <w:t>і</w:t>
-            </w:r>
-          </w:p>
-        </w:tc>
-      </w:tr>
-      <w:tr>
-        <w:tc>
-          <w:tcPr>
-            <w:tcW w:w="9026" w:type="dxa"/>
-            <w:shd w:val="clear" w:color="auto" w:fill="auto"/>
-            <w:tcMar>
-              <w:top w:w="40" w:type="dxa"/>
-              <w:left w:w="160" w:type="dxa"/>
-              <w:bottom w:w="40" w:type="dxa"/>
-              <w:right w:w="160" w:type="dxa"/>
-            </w:tcMar>
-          </w:tcPr>
-          <w:p>
-            <w:pPr>
-              <w:rPr>
-                <w:noProof/>
-              </w:rPr>
-            </w:pPr>
-            <w:r>
-              <w:rPr>
-                <w:rFonts w:ascii="Courier New" w:eastAsia="Courier New" w:hAnsi="Courier New" w:cs="Courier New"/>
-                <w:noProof/>
-                <w:sz w:val="20"/>
-                <w:szCs w:val="20"/>
-              </w:rPr>
-              <w:t xml:space="preserve">            INotificationSender emailSender = new EmailSender();</w:t>
-            </w:r>
-          </w:p>
-        </w:tc>
-      </w:tr>
-      <w:tr>
-        <w:tc>
-          <w:tcPr>
-            <w:tcW w:w="9026" w:type="dxa"/>
-            <w:shd w:val="clear" w:color="auto" w:fill="auto"/>
-            <w:tcMar>
-              <w:top w:w="40" w:type="dxa"/>
-              <w:left w:w="160" w:type="dxa"/>
-              <w:bottom w:w="40" w:type="dxa"/>
-              <w:right w:w="160" w:type="dxa"/>
-            </w:tcMar>
-          </w:tcPr>
-          <w:p>
-            <w:pPr>
-              <w:rPr>
-                <w:noProof/>
-              </w:rPr>
-            </w:pPr>
-            <w:r>
-              <w:rPr>
-                <w:rFonts w:ascii="Courier New" w:eastAsia="Courier New" w:hAnsi="Courier New" w:cs="Courier New"/>
-                <w:noProof/>
-                <w:sz w:val="20"/>
-                <w:szCs w:val="20"/>
-              </w:rPr>
-              <w:t xml:space="preserve">            new NotificationService(emailSender, repo, logger)</w:t>
-            </w:r>
-          </w:p>
-        </w:tc>
-      </w:tr>
-      <w:tr>
-        <w:tc>
-          <w:tcPr>
-            <w:tcW w:w="9026" w:type="dxa"/>
-            <w:shd w:val="clear" w:color="auto" w:fill="auto"/>
-            <w:tcMar>
-              <w:top w:w="40" w:type="dxa"/>
-              <w:left w:w="160" w:type="dxa"/>
-              <w:bottom w:w="40" w:type="dxa"/>
-              <w:right w:w="160" w:type="dxa"/>
-            </w:tcMar>
-          </w:tcPr>
-          <w:p>
-            <w:pPr>
-              <w:rPr>
-                <w:noProof/>
-              </w:rPr>
-            </w:pPr>
-            <w:r>
-              <w:rPr>
-                <w:rFonts w:ascii="Courier New" w:eastAsia="Courier New" w:hAnsi="Courier New" w:cs="Courier New"/>
-                <w:noProof/>
-                <w:sz w:val="20"/>
-                <w:szCs w:val="20"/>
-              </w:rPr>
-              <w:t xml:space="preserve">                .ProcessNotification(message);</w:t>
-            </w:r>
-          </w:p>
-        </w:tc>
-      </w:tr>
-      <w:tr>
-        <w:tc>
-          <w:tcPr>
-            <w:tcW w:w="9026" w:type="dxa"/>
-            <w:shd w:val="clear" w:color="auto" w:fill="auto"/>
-            <w:tcMar>
-              <w:top w:w="40" w:type="dxa"/>
-              <w:left w:w="160" w:type="dxa"/>
-              <w:bottom w:w="40" w:type="dxa"/>
-              <w:right w:w="160" w:type="dxa"/>
-            </w:tcMar>
-          </w:tcPr>
-          <w:p>
-            <w:pPr>
-              <w:rPr>
-                <w:noProof/>
-              </w:rPr>
-            </w:pPr>
-          </w:p>
-        </w:tc>
-      </w:tr>
-      <w:tr>
-        <w:tc>
-          <w:tcPr>
-            <w:tcW w:w="9026" w:type="dxa"/>
-            <w:shd w:val="clear" w:color="auto" w:fill="auto"/>
-            <w:tcMar>
-              <w:top w:w="40" w:type="dxa"/>
-              <w:left w:w="160" w:type="dxa"/>
-              <w:bottom w:w="40" w:type="dxa"/>
-              <w:right w:w="160" w:type="dxa"/>
-            </w:tcMar>
-          </w:tcPr>
-          <w:p>
-            <w:pPr>
-              <w:rPr>
-                <w:noProof/>
-              </w:rPr>
-            </w:pPr>
-            <w:r>
-              <w:rPr>
-                <w:rFonts w:ascii="Courier New" w:eastAsia="Courier New" w:hAnsi="Courier New" w:cs="Courier New"/>
-                <w:noProof/>
-                <w:sz w:val="20"/>
-                <w:szCs w:val="20"/>
-              </w:rPr>
-              <w:t xml:space="preserve">            INotificationSender telegramSender = new TelegramSender();</w:t>
-            </w:r>
-          </w:p>
-        </w:tc>
-      </w:tr>
-      <w:tr>
-        <w:tc>
-          <w:tcPr>
-            <w:tcW w:w="9026" w:type="dxa"/>
-            <w:shd w:val="clear" w:color="auto" w:fill="auto"/>
-            <w:tcMar>
-              <w:top w:w="40" w:type="dxa"/>
-              <w:left w:w="160" w:type="dxa"/>
-              <w:bottom w:w="40" w:type="dxa"/>
-              <w:right w:w="160" w:type="dxa"/>
-            </w:tcMar>
-          </w:tcPr>
-          <w:p>
-            <w:pPr>
-              <w:rPr>
-                <w:noProof/>
-              </w:rPr>
-            </w:pPr>
-            <w:r>
-              <w:rPr>
-                <w:rFonts w:ascii="Courier New" w:eastAsia="Courier New" w:hAnsi="Courier New" w:cs="Courier New"/>
-                <w:noProof/>
-                <w:sz w:val="20"/>
-                <w:szCs w:val="20"/>
-              </w:rPr>
-              <w:t xml:space="preserve">            new NotificationService(telegramSender, repo, logger)</w:t>
-            </w:r>
-          </w:p>
-        </w:tc>
-      </w:tr>
-      <w:tr>
-        <w:tc>
-          <w:tcPr>
-            <w:tcW w:w="9026" w:type="dxa"/>
-            <w:shd w:val="clear" w:color="auto" w:fill="auto"/>
-            <w:tcMar>
-              <w:top w:w="40" w:type="dxa"/>
-              <w:left w:w="160" w:type="dxa"/>
-              <w:bottom w:w="40" w:type="dxa"/>
-              <w:right w:w="160" w:type="dxa"/>
-            </w:tcMar>
-          </w:tcPr>
-          <w:p>
-            <w:pPr>
-              <w:rPr>
-                <w:noProof/>
-              </w:rPr>
-            </w:pPr>
-            <w:r>
-              <w:rPr>
-                <w:rFonts w:ascii="Courier New" w:eastAsia="Courier New" w:hAnsi="Courier New" w:cs="Courier New"/>
-                <w:noProof/>
-                <w:sz w:val="20"/>
-                <w:szCs w:val="20"/>
-              </w:rPr>
-              <w:t xml:space="preserve">                .ProcessNotification(message);</w:t>
-            </w:r>
-          </w:p>
-        </w:tc>
-      </w:tr>
-      <w:tr>
-        <w:tc>
-          <w:tcPr>
-            <w:tcW w:w="9026" w:type="dxa"/>
-            <w:shd w:val="clear" w:color="auto" w:fill="auto"/>
-            <w:tcMar>
-              <w:top w:w="40" w:type="dxa"/>
-              <w:left w:w="160" w:type="dxa"/>
-              <w:bottom w:w="40" w:type="dxa"/>
-              <w:right w:w="160" w:type="dxa"/>
-            </w:tcMar>
-          </w:tcPr>
-          <w:p>
-            <w:pPr>
-              <w:rPr>
-                <w:noProof/>
-              </w:rPr>
-            </w:pPr>
-          </w:p>
-        </w:tc>
-      </w:tr>
-      <w:tr>
-        <w:tc>
-          <w:tcPr>
-            <w:tcW w:w="9026" w:type="dxa"/>
-            <w:shd w:val="clear" w:color="auto" w:fill="auto"/>
-            <w:tcMar>
-              <w:top w:w="40" w:type="dxa"/>
-              <w:left w:w="160" w:type="dxa"/>
-              <w:bottom w:w="40" w:type="dxa"/>
-              <w:right w:w="160" w:type="dxa"/>
-            </w:tcMar>
-          </w:tcPr>
-          <w:p>
-            <w:pPr>
-              <w:rPr>
-                <w:noProof/>
-              </w:rPr>
-            </w:pPr>
-            <w:r>
-              <w:rPr>
-                <w:rFonts w:ascii="Courier New" w:eastAsia="Courier New" w:hAnsi="Courier New" w:cs="Courier New"/>
-                <w:noProof/>
-                <w:sz w:val="20"/>
-                <w:szCs w:val="20"/>
-              </w:rPr>
-              <w:t xml:space="preserve">            INotificationSender pushSender = new PushSender();</w:t>
-            </w:r>
-          </w:p>
-        </w:tc>
-      </w:tr>
-      <w:tr>
-        <w:tc>
-          <w:tcPr>
-            <w:tcW w:w="9026" w:type="dxa"/>
-            <w:shd w:val="clear" w:color="auto" w:fill="auto"/>
-            <w:tcMar>
-              <w:top w:w="40" w:type="dxa"/>
-              <w:left w:w="160" w:type="dxa"/>
-              <w:bottom w:w="40" w:type="dxa"/>
-              <w:right w:w="160" w:type="dxa"/>
-            </w:tcMar>
-          </w:tcPr>
-          <w:p>
-            <w:pPr>
-              <w:rPr>
-                <w:noProof/>
-              </w:rPr>
-            </w:pPr>
-            <w:r>
-              <w:rPr>
-                <w:rFonts w:ascii="Courier New" w:eastAsia="Courier New" w:hAnsi="Courier New" w:cs="Courier New"/>
-                <w:noProof/>
-                <w:sz w:val="20"/>
-                <w:szCs w:val="20"/>
-              </w:rPr>
-              <w:t xml:space="preserve">            new NotificationService(pushSender, repo, logger)</w:t>
-            </w:r>
-          </w:p>
-        </w:tc>
-      </w:tr>
-      <w:tr>
-        <w:tc>
-          <w:tcPr>
-            <w:tcW w:w="9026" w:type="dxa"/>
-            <w:shd w:val="clear" w:color="auto" w:fill="auto"/>
-            <w:tcMar>
-              <w:top w:w="40" w:type="dxa"/>
-              <w:left w:w="160" w:type="dxa"/>
-              <w:bottom w:w="40" w:type="dxa"/>
-              <w:right w:w="160" w:type="dxa"/>
-            </w:tcMar>
-          </w:tcPr>
-          <w:p>
-            <w:pPr>
-              <w:rPr>
-                <w:noProof/>
-              </w:rPr>
-            </w:pPr>
-            <w:r>
-              <w:rPr>
-                <w:rFonts w:ascii="Courier New" w:eastAsia="Courier New" w:hAnsi="Courier New" w:cs="Courier New"/>
-                <w:noProof/>
-                <w:sz w:val="20"/>
-                <w:szCs w:val="20"/>
-              </w:rPr>
-              <w:t xml:space="preserve">                .ProcessNotification(message);</w:t>
-            </w:r>
-          </w:p>
-        </w:tc>
-      </w:tr>
-      <w:tr>
-        <w:tc>
-          <w:tcPr>
-            <w:tcW w:w="9026" w:type="dxa"/>
-            <w:shd w:val="clear" w:color="auto" w:fill="auto"/>
-            <w:tcMar>
-              <w:top w:w="40" w:type="dxa"/>
-              <w:left w:w="160" w:type="dxa"/>
-              <w:bottom w:w="40" w:type="dxa"/>
-              <w:right w:w="160" w:type="dxa"/>
-            </w:tcMar>
-          </w:tcPr>
-          <w:p>
-            <w:pPr>
-              <w:rPr>
-                <w:noProof/>
-              </w:rPr>
-            </w:pPr>
-          </w:p>
-        </w:tc>
-      </w:tr>
-      <w:tr>
-        <w:tc>
-          <w:tcPr>
-            <w:tcW w:w="9026" w:type="dxa"/>
-            <w:shd w:val="clear" w:color="auto" w:fill="auto"/>
-            <w:tcMar>
-              <w:top w:w="40" w:type="dxa"/>
-              <w:left w:w="160" w:type="dxa"/>
-              <w:bottom w:w="40" w:type="dxa"/>
-              <w:right w:w="160" w:type="dxa"/>
-            </w:tcMar>
-          </w:tcPr>
-          <w:p>
-            <w:pPr>
-              <w:rPr>
-                <w:noProof/>
-              </w:rPr>
-            </w:pPr>
-            <w:r>
-              <w:rPr>
-                <w:rFonts w:ascii="Courier New" w:eastAsia="Courier New" w:hAnsi="Courier New" w:cs="Courier New"/>
-                <w:noProof/>
-                <w:sz w:val="20"/>
-                <w:szCs w:val="20"/>
-              </w:rPr>
-              <w:t xml:space="preserve">            INotificationSender smsSender = new SmsSender();</w:t>
-            </w:r>
-          </w:p>
-        </w:tc>
-      </w:tr>
-      <w:tr>
-        <w:tc>
-          <w:tcPr>
-            <w:tcW w:w="9026" w:type="dxa"/>
-            <w:shd w:val="clear" w:color="auto" w:fill="auto"/>
-            <w:tcMar>
-              <w:top w:w="40" w:type="dxa"/>
-              <w:left w:w="160" w:type="dxa"/>
-              <w:bottom w:w="40" w:type="dxa"/>
-              <w:right w:w="160" w:type="dxa"/>
-            </w:tcMar>
-          </w:tcPr>
-          <w:p>
-            <w:pPr>
-              <w:rPr>
-                <w:noProof/>
-              </w:rPr>
-            </w:pPr>
-            <w:r>
-              <w:rPr>
-                <w:rFonts w:ascii="Courier New" w:eastAsia="Courier New" w:hAnsi="Courier New" w:cs="Courier New"/>
-                <w:noProof/>
-                <w:sz w:val="20"/>
-                <w:szCs w:val="20"/>
-              </w:rPr>
-              <w:t xml:space="preserve">            new NotificationService(smsSender, repo, logger)</w:t>
-            </w:r>
-          </w:p>
-        </w:tc>
-      </w:tr>
-      <w:tr>
-        <w:tc>
-          <w:tcPr>
-            <w:tcW w:w="9026" w:type="dxa"/>
-            <w:shd w:val="clear" w:color="auto" w:fill="auto"/>
-            <w:tcMar>
-              <w:top w:w="40" w:type="dxa"/>
-              <w:left w:w="160" w:type="dxa"/>
-              <w:bottom w:w="40" w:type="dxa"/>
-              <w:right w:w="160" w:type="dxa"/>
-            </w:tcMar>
-          </w:tcPr>
-          <w:p>
-            <w:pPr>
-              <w:rPr>
-                <w:noProof/>
-              </w:rPr>
-            </w:pPr>
-            <w:r>
-              <w:rPr>
-                <w:rFonts w:ascii="Courier New" w:eastAsia="Courier New" w:hAnsi="Courier New" w:cs="Courier New"/>
-                <w:noProof/>
-                <w:sz w:val="20"/>
-                <w:szCs w:val="20"/>
-              </w:rPr>
-              <w:t xml:space="preserve">                .ProcessNotification(message);</w:t>
+              <w:t xml:space="preserve">            </w:t>
+            </w:r>
+            <w:r>
+              <w:rPr>
+                <w:rFonts w:ascii="Courier New" w:eastAsia="Courier New" w:hAnsi="Courier New" w:cs="Courier New"/>
+                <w:noProof/>
+                <w:color w:val="000000" w:themeColor="text1"/>
+                <w:sz w:val="20"/>
+                <w:szCs w:val="20"/>
+              </w:rPr>
+              <w:t>foreach (var sender in senders)</w:t>
+            </w:r>
+          </w:p>
+          <w:p>
+            <w:pPr>
+              <w:rPr>
+                <w:rFonts w:ascii="Courier New" w:eastAsia="Courier New" w:hAnsi="Courier New" w:cs="Courier New"/>
+                <w:noProof/>
+                <w:color w:val="000000" w:themeColor="text1"/>
+                <w:sz w:val="20"/>
+                <w:szCs w:val="20"/>
+              </w:rPr>
+            </w:pPr>
+            <w:r>
+              <w:rPr>
+                <w:rFonts w:ascii="Courier New" w:eastAsia="Courier New" w:hAnsi="Courier New" w:cs="Courier New"/>
+                <w:noProof/>
+                <w:color w:val="000000" w:themeColor="text1"/>
+                <w:sz w:val="20"/>
+                <w:szCs w:val="20"/>
+              </w:rPr>
+              <w:t xml:space="preserve">            {</w:t>
+            </w:r>
+          </w:p>
+          <w:p>
+            <w:pPr>
+              <w:rPr>
+                <w:rFonts w:ascii="Courier New" w:eastAsia="Courier New" w:hAnsi="Courier New" w:cs="Courier New"/>
+                <w:noProof/>
+                <w:color w:val="000000" w:themeColor="text1"/>
+                <w:sz w:val="20"/>
+                <w:szCs w:val="20"/>
+              </w:rPr>
+            </w:pPr>
+            <w:r>
+              <w:rPr>
+                <w:rFonts w:ascii="Courier New" w:eastAsia="Courier New" w:hAnsi="Courier New" w:cs="Courier New"/>
+                <w:noProof/>
+                <w:color w:val="000000" w:themeColor="text1"/>
+                <w:sz w:val="20"/>
+                <w:szCs w:val="20"/>
+              </w:rPr>
+              <w:t xml:space="preserve">                NotificationService service = new NotificationService(sender, repo, logger);</w:t>
+            </w:r>
+          </w:p>
+          <w:p>
+            <w:pPr>
+              <w:rPr>
+                <w:rFonts w:ascii="Courier New" w:eastAsia="Courier New" w:hAnsi="Courier New" w:cs="Courier New"/>
+                <w:noProof/>
+                <w:color w:val="000000" w:themeColor="text1"/>
+                <w:sz w:val="20"/>
+                <w:szCs w:val="20"/>
+              </w:rPr>
+            </w:pPr>
+            <w:r>
+              <w:rPr>
+                <w:rFonts w:ascii="Courier New" w:eastAsia="Courier New" w:hAnsi="Courier New" w:cs="Courier New"/>
+                <w:noProof/>
+                <w:color w:val="000000" w:themeColor="text1"/>
+                <w:sz w:val="20"/>
+                <w:szCs w:val="20"/>
+              </w:rPr>
+              <w:t xml:space="preserve">                service.ProcessNotification(message);</w:t>
+            </w:r>
+          </w:p>
+          <w:p>
+            <w:pPr>
+              <w:rPr>
+                <w:rFonts w:ascii="Courier New" w:eastAsia="Courier New" w:hAnsi="Courier New" w:cs="Courier New"/>
+                <w:noProof/>
+                <w:color w:val="000000" w:themeColor="text1"/>
+                <w:sz w:val="20"/>
+                <w:szCs w:val="20"/>
+              </w:rPr>
+            </w:pPr>
+            <w:r>
+              <w:rPr>
+                <w:rFonts w:ascii="Courier New" w:eastAsia="Courier New" w:hAnsi="Courier New" w:cs="Courier New"/>
+                <w:noProof/>
+                <w:color w:val="000000" w:themeColor="text1"/>
+                <w:sz w:val="20"/>
+                <w:szCs w:val="20"/>
+              </w:rPr>
+              <w:t xml:space="preserve">                </w:t>
+            </w:r>
+          </w:p>
+          <w:p>
+            <w:pPr>
+              <w:rPr>
+                <w:rFonts w:ascii="Courier New" w:eastAsia="Courier New" w:hAnsi="Courier New" w:cs="Courier New"/>
+                <w:noProof/>
+                <w:color w:val="000000" w:themeColor="text1"/>
+                <w:sz w:val="20"/>
+                <w:szCs w:val="20"/>
+              </w:rPr>
+            </w:pPr>
+            <w:r>
+              <w:rPr>
+                <w:rFonts w:ascii="Courier New" w:eastAsia="Courier New" w:hAnsi="Courier New" w:cs="Courier New"/>
+                <w:noProof/>
+                <w:color w:val="000000" w:themeColor="text1"/>
+                <w:sz w:val="20"/>
+                <w:szCs w:val="20"/>
+              </w:rPr>
+              <w:t xml:space="preserve">                // Просто роздільник для красивого виводу в консоль</w:t>
+            </w:r>
+          </w:p>
+          <w:p>
+            <w:pPr>
+              <w:rPr>
+                <w:rFonts w:ascii="Courier New" w:eastAsia="Courier New" w:hAnsi="Courier New" w:cs="Courier New"/>
+                <w:noProof/>
+                <w:color w:val="000000" w:themeColor="text1"/>
+                <w:sz w:val="20"/>
+                <w:szCs w:val="20"/>
+              </w:rPr>
+            </w:pPr>
+            <w:r>
+              <w:rPr>
+                <w:rFonts w:ascii="Courier New" w:eastAsia="Courier New" w:hAnsi="Courier New" w:cs="Courier New"/>
+                <w:noProof/>
+                <w:color w:val="000000" w:themeColor="text1"/>
+                <w:sz w:val="20"/>
+                <w:szCs w:val="20"/>
+              </w:rPr>
+              <w:t xml:space="preserve">                Console.WriteLine(new string('-', 40)); </w:t>
+            </w:r>
+          </w:p>
+          <w:p>
+            <w:pPr>
+              <w:rPr>
+                <w:rFonts w:ascii="Courier New" w:eastAsia="Courier New" w:hAnsi="Courier New" w:cs="Courier New"/>
+                <w:noProof/>
+              </w:rPr>
+            </w:pPr>
+            <w:r>
+              <w:rPr>
+                <w:rFonts w:ascii="Courier New" w:eastAsia="Courier New" w:hAnsi="Courier New" w:cs="Courier New"/>
+                <w:noProof/>
+                <w:color w:val="000000" w:themeColor="text1"/>
+                <w:sz w:val="20"/>
+                <w:szCs w:val="20"/>
+              </w:rPr>
+              <w:t xml:space="preserve">            }</w:t>
             </w:r>
           </w:p>
         </w:tc>
@@ -7907,7 +7758,6 @@
   <w:style w:type="character" w:default="1" w:styleId="a0">
     <w:name w:val="Default Paragraph Font"/>
     <w:uiPriority w:val="1"/>
-    <w:semiHidden/>
     <w:unhideWhenUsed/>
   </w:style>
   <w:style w:type="table" w:default="1" w:styleId="a1">

</xml_diff>

<commit_message>
docs: added uml class diagram and updated lab10 report.
</commit_message>
<xml_diff>
--- a/lab10/Лабораторна робота №10.docx
+++ b/lab10/Лабораторна робота №10.docx
@@ -1646,6 +1646,7 @@
     <w:p>
       <w:pPr>
         <w:spacing w:line="360" w:lineRule="auto"/>
+        <w:ind w:firstLine="708"/>
         <w:jc w:val="both"/>
         <w:rPr>
           <w:noProof/>
@@ -1659,6 +1660,112 @@
           <w:sz w:val="28"/>
           <w:szCs w:val="28"/>
         </w:rPr>
+        <w:t>Н</w:t>
+      </w:r>
+      <w:r>
+        <w:rPr>
+          <w:noProof/>
+          <w:sz w:val="28"/>
+          <w:szCs w:val="28"/>
+        </w:rPr>
+        <w:t>ижче наведена UML діаграма класів. Вона наочно візуалізує чіткий розподіл відповідальності на окремі сутності, використання спеціалізованих інтерфейсів як контрактів та ін'єкцію залежностей у головний сервіс</w:t>
+      </w:r>
+      <w:r>
+        <w:rPr>
+          <w:noProof/>
+          <w:sz w:val="28"/>
+          <w:szCs w:val="28"/>
+        </w:rPr>
+        <w:t>:</w:t>
+      </w:r>
+    </w:p>
+    <w:p>
+      <w:pPr>
+        <w:spacing w:line="360" w:lineRule="auto"/>
+        <w:jc w:val="both"/>
+        <w:rPr>
+          <w:noProof/>
+          <w:sz w:val="28"/>
+          <w:szCs w:val="28"/>
+        </w:rPr>
+      </w:pPr>
+    </w:p>
+    <w:p>
+      <w:pPr>
+        <w:spacing w:line="360" w:lineRule="auto"/>
+        <w:jc w:val="both"/>
+        <w:rPr>
+          <w:noProof/>
+          <w:sz w:val="28"/>
+          <w:szCs w:val="28"/>
+        </w:rPr>
+      </w:pPr>
+      <w:r>
+        <w:rPr>
+          <w:noProof/>
+          <w:sz w:val="28"/>
+          <w:szCs w:val="28"/>
+        </w:rPr>
+        <w:drawing>
+          <wp:inline distT="0" distB="0" distL="0" distR="0" wp14:anchorId="096EA98A" wp14:editId="1FACAFB8">
+            <wp:extent cx="5939790" cy="3100705"/>
+            <wp:effectExtent l="0" t="0" r="3810" b="4445"/>
+            <wp:docPr id="3" name="Рисунок 3" descr="Зображення, що містить текст, схема, Паралель, ряд&#10;&#10;Вміст, створений ШІ, може бути неправильним."/>
+            <wp:cNvGraphicFramePr>
+              <a:graphicFrameLocks xmlns:a="http://schemas.openxmlformats.org/drawingml/2006/main" noChangeAspect="1"/>
+            </wp:cNvGraphicFramePr>
+            <a:graphic xmlns:a="http://schemas.openxmlformats.org/drawingml/2006/main">
+              <a:graphicData uri="http://schemas.openxmlformats.org/drawingml/2006/picture">
+                <pic:pic xmlns:pic="http://schemas.openxmlformats.org/drawingml/2006/picture">
+                  <pic:nvPicPr>
+                    <pic:cNvPr id="3" name="Рисунок 3" descr="Зображення, що містить текст, схема, Паралель, ряд&#10;&#10;Вміст, створений ШІ, може бути неправильним."/>
+                    <pic:cNvPicPr/>
+                  </pic:nvPicPr>
+                  <pic:blipFill>
+                    <a:blip r:embed="rId5">
+                      <a:extLst>
+                        <a:ext uri="{28A0092B-C50C-407E-A947-70E740481C1C}">
+                          <a14:useLocalDpi xmlns:a14="http://schemas.microsoft.com/office/drawing/2010/main" val="0"/>
+                        </a:ext>
+                      </a:extLst>
+                    </a:blip>
+                    <a:stretch>
+                      <a:fillRect/>
+                    </a:stretch>
+                  </pic:blipFill>
+                  <pic:spPr>
+                    <a:xfrm>
+                      <a:off x="0" y="0"/>
+                      <a:ext cx="5939790" cy="3100705"/>
+                    </a:xfrm>
+                    <a:prstGeom prst="rect">
+                      <a:avLst/>
+                    </a:prstGeom>
+                  </pic:spPr>
+                </pic:pic>
+              </a:graphicData>
+            </a:graphic>
+          </wp:inline>
+        </w:drawing>
+      </w:r>
+    </w:p>
+    <w:p>
+      <w:pPr>
+        <w:spacing w:line="360" w:lineRule="auto"/>
+        <w:jc w:val="both"/>
+        <w:rPr>
+          <w:noProof/>
+          <w:sz w:val="28"/>
+          <w:szCs w:val="28"/>
+        </w:rPr>
+      </w:pPr>
+      <w:r>
+        <w:rPr>
+          <w:noProof/>
+          <w:sz w:val="28"/>
+          <w:szCs w:val="28"/>
+        </w:rPr>
+        <w:lastRenderedPageBreak/>
         <w:drawing>
           <wp:inline distT="0" distB="0" distL="0" distR="0" wp14:anchorId="6583ADC2" wp14:editId="6EA51B6E">
             <wp:extent cx="2660048" cy="3240000"/>
@@ -1675,7 +1782,7 @@
                     <pic:cNvPicPr/>
                   </pic:nvPicPr>
                   <pic:blipFill rotWithShape="1">
-                    <a:blip r:embed="rId5"/>
+                    <a:blip r:embed="rId6"/>
                     <a:srcRect r="29503"/>
                     <a:stretch/>
                   </pic:blipFill>
@@ -1732,7 +1839,7 @@
                     <pic:cNvPicPr/>
                   </pic:nvPicPr>
                   <pic:blipFill>
-                    <a:blip r:embed="rId6"/>
+                    <a:blip r:embed="rId7"/>
                     <a:stretch>
                       <a:fillRect/>
                     </a:stretch>
@@ -2102,7 +2209,6 @@
           <w:sz w:val="28"/>
           <w:szCs w:val="28"/>
         </w:rPr>
-        <w:lastRenderedPageBreak/>
         <w:t>ILogger.cs</w:t>
       </w:r>
     </w:p>
@@ -2560,6 +2666,7 @@
                 <w:sz w:val="20"/>
                 <w:szCs w:val="20"/>
               </w:rPr>
+              <w:lastRenderedPageBreak/>
               <w:t xml:space="preserve">    public interface INotificationRepository</w:t>
             </w:r>
           </w:p>
@@ -3410,7 +3517,6 @@
                 <w:sz w:val="20"/>
                 <w:szCs w:val="20"/>
               </w:rPr>
-              <w:lastRenderedPageBreak/>
               <w:t xml:space="preserve">        }</w:t>
             </w:r>
           </w:p>
@@ -3837,6 +3943,7 @@
                 <w:sz w:val="20"/>
                 <w:szCs w:val="20"/>
               </w:rPr>
+              <w:lastRenderedPageBreak/>
               <w:t xml:space="preserve">    }</w:t>
             </w:r>
           </w:p>
@@ -4664,7 +4771,6 @@
           <w:sz w:val="28"/>
           <w:szCs w:val="28"/>
         </w:rPr>
-        <w:lastRenderedPageBreak/>
         <w:t>TelegramSender.cs</w:t>
       </w:r>
     </w:p>
@@ -5060,6 +5166,7 @@
           <w:sz w:val="28"/>
           <w:szCs w:val="28"/>
         </w:rPr>
+        <w:lastRenderedPageBreak/>
         <w:t>NotificationService.cs</w:t>
       </w:r>
     </w:p>
@@ -6028,7 +6135,6 @@
           <w:sz w:val="28"/>
           <w:szCs w:val="28"/>
         </w:rPr>
-        <w:lastRenderedPageBreak/>
         <w:t>Program.cs</w:t>
       </w:r>
     </w:p>
@@ -7054,7 +7160,23 @@
           <w:sz w:val="28"/>
           <w:szCs w:val="28"/>
         </w:rPr>
-        <w:t>У ході виконання практичної роботи було проведено рефакторинг системи сповіщень відповідно до всіх п'яти принципів SOLID. Початковий клас NotificationService порушував усі ці принципи: він мав кілька відповідальностей, не дозволяв розширення без модифікації, не використовував абстракцій та об'єднував несумісні обов'язки в одному місці.</w:t>
+        <w:t>У ході виконання практичної роботи було проведено рефакторинг системи сповіщень відповідно до всіх п'яти принципів SOLID. Початковий клас NotificationService порушував усі ці принципи</w:t>
+      </w:r>
+      <w:r>
+        <w:rPr>
+          <w:noProof/>
+          <w:sz w:val="28"/>
+          <w:szCs w:val="28"/>
+        </w:rPr>
+        <w:t>. В</w:t>
+      </w:r>
+      <w:r>
+        <w:rPr>
+          <w:noProof/>
+          <w:sz w:val="28"/>
+          <w:szCs w:val="28"/>
+        </w:rPr>
+        <w:t>ін мав кілька відповідальностей, не дозволяв розширення без модифікації, не використовував абстракцій та об'єднував несумісні обов'язки в одному місці.</w:t>
       </w:r>
     </w:p>
     <w:p>
@@ -7074,7 +7196,23 @@
           <w:sz w:val="28"/>
           <w:szCs w:val="28"/>
         </w:rPr>
-        <w:t>Після рефакторингу система стала значно більш гнучкою: додавання нового каналу сповіщення зводиться до створення одного нового класу без торкання існуючого коду. Кожен клас виконує одну чітку функцію, а залежності передаються через інтерфейси, що спрощує тестування та підтримку коду.</w:t>
+        <w:t>Після рефакторингу система стала значно більш гнучкою</w:t>
+      </w:r>
+      <w:r>
+        <w:rPr>
+          <w:noProof/>
+          <w:sz w:val="28"/>
+          <w:szCs w:val="28"/>
+        </w:rPr>
+        <w:t>. Д</w:t>
+      </w:r>
+      <w:r>
+        <w:rPr>
+          <w:noProof/>
+          <w:sz w:val="28"/>
+          <w:szCs w:val="28"/>
+        </w:rPr>
+        <w:t>одавання нового каналу сповіщення зводиться до створення одного нового класу без торкання існуючого коду. Кожен клас виконує одну чітку функцію, а залежності передаються через інтерфейси, що спрощує тестування та підтримку коду.</w:t>
       </w:r>
     </w:p>
     <w:sectPr>

</xml_diff>